<commit_message>
Fix six number-transcription errors found by independent audit; add regression check
</commit_message>
<xml_diff>
--- a/paper/Статья_МНПК_АТУ_2026_Амирханов.docx
+++ b/paper/Статья_МНПК_АТУ_2026_Амирханов.docx
@@ -111,7 +111,7 @@
           <w:i w:val="0"/>
           <w:sz w:val="28"/>
         </w:rPr>
-        <w:t>Результаты приведены в таблице 1. На батче 32 ConvNeXt-Tiny выдаёт 1680 изображений/с в режиме «только вывод» против 1270 у ResNet-50 и 1240 у ViT-B/16; на одиночных изображениях задержка составляет 1,6–1,8 мс. Сквозной режим на батче 8 даёт 1371 изображение/с у ConvNeXt-Tiny и 1093 у ViT-B/16 при 0,045 и 0,064 Дж на изображение соответственно. Расхождение режимов достигает 29 %: столько стоит предобработка на CPU.</w:t>
+        <w:t>Результаты приведены в таблице 1. На батче 32 ConvNeXt-Tiny выдаёт 1680 изображений/с в режиме «только вывод» против 1270 у ResNet-50 и 1240 у ViT-B/16; на одиночных изображениях задержка составляет 1,6–1,8 мс. Сквозной режим на батче 8 даёт 1370 изображений/с у ConvNeXt-Tiny и 1093 у ViT-B/16 при 0,045 и 0,064 Дж на изображение соответственно. Расхождение режимов достигает 29 %: столько стоит предобработка на CPU.</w:t>
       </w:r>
     </w:p>
     <w:p>
@@ -340,7 +340,7 @@
                 <w:rFonts w:ascii="Times New Roman" w:hAnsi="Times New Roman"/>
                 <w:sz w:val="23"/>
               </w:rPr>
-              <w:t>497</w:t>
+              <w:t>496</w:t>
             </w:r>
           </w:p>
         </w:tc>
@@ -456,7 +456,7 @@
                 <w:rFonts w:ascii="Times New Roman" w:hAnsi="Times New Roman"/>
                 <w:sz w:val="23"/>
               </w:rPr>
-              <w:t>1371</w:t>
+              <w:t>1370</w:t>
             </w:r>
           </w:p>
         </w:tc>
@@ -1396,7 +1396,7 @@
           <w:i w:val="0"/>
           <w:sz w:val="28"/>
         </w:rPr>
-        <w:t>Процессорный вывод служит нижней границей: на батче 32 ConvNeXt-Tiny даёт 39,4 изображений/с, ViT-B/16 — 14,9, на батче 1 — 17,4 и 8,2. Ускорение на GPU составляет от 36 до 106 раз, энергия ниже в 9–17 раз. Переход с FP32 на FP16 на батче 32 ускоряет вывод в 1,8–3,6 раза и снижает энергию в 1,7–4,5 раза, BF16 практически повторяет FP16. На миллион изображений лучшая конфигурация расходует около 12,6 Вт·ч, процессорная — около 98 Вт·ч.</w:t>
+        <w:t>Процессорный вывод служит нижней границей: на батче 32 ConvNeXt-Tiny даёт 39,4 изображений/с, ViT-B/16 — 14,9, на батче 1 — 17,4 и 8,2. Ускорение на GPU составляет от 36 до 106 раз, энергия на изображение ниже в 8,7–16,5 раза. Переход с FP32 на FP16 на батче 32 ускоряет вывод в 1,8–3,6 раза и снижает энергию в 1,7–4,5 раза, BF16 практически повторяет FP16. На миллион изображений лучшая конфигурация расходует около 12,3 Вт·ч, процессорная — около 98 Вт·ч.</w:t>
       </w:r>
     </w:p>
     <w:p>
@@ -1412,7 +1412,7 @@
           <w:i w:val="0"/>
           <w:sz w:val="28"/>
         </w:rPr>
-        <w:t>Точность зонда усреднена по трём разбиениям выборки. При 50 изображениях на класс ViT-B/16 даёт 62,1 % top-1, ConvNeXt-Tiny — 60,9 %, ResNet-50 — 47,2 %; при 25 изображениях — 54,5 %, 55,0 % и 30,5 % соответственно. Примерно 2,5 тысячи размеченных кадров нового класса подводят к насыщению; удвоение выборки добавляет 5–7 процентных пунктов. На выборках в 5–10 изображений признаки ResNet-50 растут немонотонно, а ConvNeXt-Tiny и ViT-B/16 — устойчиво.</w:t>
+        <w:t>Точность зонда усреднена по трём разбиениям выборки. При 50 изображениях на класс ViT-B/16 даёт 62,1 % top-1, ConvNeXt-Tiny — 60,9 %, ResNet-50 — 47,2 %; при 25 изображениях — 54,5 %, 55,0 % и 30,5 % соответственно. Примерно 2,5 тысячи размеченных кадров нового класса дают основную часть прироста: дальнейшее удвоение выборки добавляет 5,9 п.п. у ConvNeXt-Tiny, 7,5 п.п. у ViT-B/16 и 16,7 п.п. у ResNet-50. На выборках в 5–10 изображений признаки ResNet-50 растут немонотонно, а ConvNeXt-Tiny и ViT-B/16 — устойчиво.</w:t>
       </w:r>
     </w:p>
     <w:p>
@@ -1484,7 +1484,7 @@
           <w:i w:val="0"/>
           <w:sz w:val="28"/>
         </w:rPr>
-        <w:t>Обсуждение и ограничения. Числа описывают узел как элемент линии: 1371 изображение/с в сквозном режиме эквивалентны примерно 45 потокам по 30 кадров/с при разрешении 224×224, то есть один стенд закрывает участок, а не одну камеру. Рабочая точка — батч 8: ускоритель выходит на плато, задержка остаётся в пределах 5–7 мс. Измерена классификация, а не детекция дефектов; использованы один стенд и один набор данных; квантование INT8 и TensorRT не рассматривались.</w:t>
+        <w:t>Обсуждение и ограничения. Числа описывают узел как элемент линии: 1370 изображений/с в сквозном режиме эквивалентны примерно 46 потокам по 30 кадров/с при разрешении 224×224, то есть один стенд закрывает участок, а не одну камеру. Рабочая точка — батч 8: ускоритель выходит на плато, задержка остаётся в пределах 5–7 мс. Измерена классификация, а не детекция дефектов; использованы один стенд и один набор данных; квантование INT8 и TensorRT не рассматривались.</w:t>
       </w:r>
     </w:p>
     <w:p>
@@ -1500,7 +1500,7 @@
           <w:i w:val="0"/>
           <w:sz w:val="28"/>
         </w:rPr>
-        <w:t>Заключение. На открытом наборе Food-101 измерены задержка, пропускная способность и энергопотребление локального вывода трёх моделей компьютерного зрения на ARM64-платформе с GPU GB10. Сквозная обработка достигает 1371 изображения/с при 0,045 Дж на изображение, что на порядок экономичнее процессорного варианта; линейный зонд на 25 изображениях на класс даёт около 55 % top-1 по 101 классу, что задаёт ориентир объёма разметки при вводе нового вида продукции. Скрипты и первичные данные измерений доступны в репозитории [10].</w:t>
+        <w:t>Заключение. На открытом наборе Food-101 измерены задержка, пропускная способность и энергопотребление локального вывода трёх моделей компьютерного зрения на ARM64-платформе с GPU GB10. Сквозная обработка достигает 1370 изображений/с при 0,045 Дж на изображение, что почти в 8 раз экономичнее процессорного варианта; линейный зонд на 25 изображениях на класс даёт около 55 % top-1 по 101 классу, что задаёт ориентир объёма разметки при вводе нового вида продукции. Скрипты и первичные данные измерений доступны в репозитории [10].</w:t>
       </w:r>
     </w:p>
     <w:p>

</xml_diff>